<commit_message>
Included semesters, CA grading and Exam Grading. Making the system more functional
</commit_message>
<xml_diff>
--- a/Documentation/Document File/Internship_Report_Final-2.docx
+++ b/Documentation/Document File/Internship_Report_Final-2.docx
@@ -1138,7 +1138,19 @@
         <w:rPr>
           <w:color w:val="auto"/>
         </w:rPr>
-        <w:t xml:space="preserve">, particularly the CEO, </w:t>
+        <w:t xml:space="preserve">, particularly the </w:t>
+      </w:r>
+      <w:r>
+        <w:rPr>
+          <w:color w:val="auto"/>
+        </w:rPr>
+        <w:t>DIRECTOR</w:t>
+      </w:r>
+      <w:r>
+        <w:rPr>
+          <w:color w:val="auto"/>
+        </w:rPr>
+        <w:t xml:space="preserve">, </w:t>
       </w:r>
       <w:r>
         <w:rPr>
@@ -1511,7 +1523,21 @@
         <w:rPr>
           <w:color w:val="auto"/>
         </w:rPr>
-        <w:t xml:space="preserve">pour la gestion des données hors ligne. Les fonctionnalités clés mises en œuvre comprennent le contrôle d'accès basé sur les rôles (RBAC) pour les étudiants et les enseignants, un système CRUD (Créer, Lire, Mettre à jour, Supprimer) pour la gestion des notes, et un mécanisme de feedback sécurisé. Le projet a démontré avec succès qu'une architecture légère et hors ligne peut gérer efficacement les dossiers académiques tout en garantissant la confidentialité des données et en </w:t>
+        <w:t xml:space="preserve">pour la gestion des données hors ligne. Les fonctionnalités clés mises en œuvre comprennent le contrôle d'accès basé sur les rôles (RBAC) pour les étudiants et les enseignants, un système CRUD (Créer, Lire, Mettre à jour, Supprimer) pour la gestion des notes, et un mécanisme de feedback sécurisé. Le projet a démontré avec succès qu'une architecture légère et hors ligne peut gérer efficacement les dossiers académiques tout en garantissant la confidentialité des données et </w:t>
+      </w:r>
+      <w:proofErr w:type="spellStart"/>
+      <w:r>
+        <w:rPr>
+          <w:color w:val="auto"/>
+        </w:rPr>
+        <w:t>en</w:t>
+      </w:r>
+      <w:proofErr w:type="spellEnd"/>
+      <w:r>
+        <w:rPr>
+          <w:color w:val="auto"/>
+        </w:rPr>
+        <w:t xml:space="preserve"> </w:t>
       </w:r>
       <w:proofErr w:type="spellStart"/>
       <w:r>
@@ -1574,6 +1600,15 @@
     </w:p>
     <w:sdt>
       <w:sdtPr>
+        <w:rPr>
+          <w:rFonts w:ascii="Times New Roman" w:eastAsia="Times New Roman" w:hAnsi="Times New Roman" w:cs="Times New Roman"/>
+          <w:color w:val="415462"/>
+          <w:kern w:val="2"/>
+          <w:sz w:val="24"/>
+          <w:szCs w:val="24"/>
+          <w:lang w:val="en-GB" w:eastAsia="en-GB"/>
+          <w14:ligatures w14:val="standardContextual"/>
+        </w:rPr>
         <w:id w:val="-1050913707"/>
         <w:docPartObj>
           <w:docPartGallery w:val="Table of Contents"/>
@@ -1582,16 +1617,9 @@
       </w:sdtPr>
       <w:sdtEndPr>
         <w:rPr>
-          <w:rFonts w:ascii="Times New Roman" w:eastAsia="Times New Roman" w:hAnsi="Times New Roman" w:cs="Times New Roman"/>
           <w:b/>
           <w:bCs/>
           <w:noProof/>
-          <w:color w:val="415462"/>
-          <w:kern w:val="2"/>
-          <w:sz w:val="24"/>
-          <w:szCs w:val="24"/>
-          <w:lang w:val="en-GB" w:eastAsia="en-GB"/>
-          <w14:ligatures w14:val="standardContextual"/>
         </w:rPr>
       </w:sdtEndPr>
       <w:sdtContent>
@@ -3626,7 +3654,15 @@
                 <w:color w:val="auto"/>
                 <w:sz w:val="19"/>
               </w:rPr>
-              <w:t>CEO / Founder</w:t>
+              <w:t>DIRECTOR</w:t>
+            </w:r>
+            <w:r>
+              <w:rPr>
+                <w:rFonts w:ascii="Calibri" w:eastAsia="Calibri" w:hAnsi="Calibri" w:cs="Calibri"/>
+                <w:color w:val="auto"/>
+                <w:sz w:val="19"/>
+              </w:rPr>
+              <w:t xml:space="preserve"> / Founder</w:t>
             </w:r>
           </w:p>
         </w:tc>
@@ -6784,7 +6820,21 @@
         <w:rPr>
           <w:color w:val="auto"/>
         </w:rPr>
-        <w:t>In the digital age, data is the lifeblood of any educational institution. From enrollment figures to academic performance records, schools generate massive amounts of information daily. However, managing this data remains a significant challenge for many small to medium-sized institutions in Cameroon. Traditionally, student records have been maintained using physical files, paper registers, and disjointed spreadsheet documents. While these methods served their purpose in the past, they are increasingly becoming obsolete due to inefficiencies, susceptibility to damage, and difficulty in data retrieval.</w:t>
+        <w:t xml:space="preserve">In the digital age, data is the lifeblood of any educational institution. From enrollment figures to academic performance records, schools generate massive amounts of information daily. However, managing this data remains a significant challenge for many </w:t>
+      </w:r>
+      <w:proofErr w:type="gramStart"/>
+      <w:r>
+        <w:rPr>
+          <w:color w:val="auto"/>
+        </w:rPr>
+        <w:t>small</w:t>
+      </w:r>
+      <w:proofErr w:type="gramEnd"/>
+      <w:r>
+        <w:rPr>
+          <w:color w:val="auto"/>
+        </w:rPr>
+        <w:t xml:space="preserve"> to medium-sized institutions in Cameroon. Traditionally, student records have been maintained using physical files, paper registers, and disjointed spreadsheet documents. While these methods served their purpose in the past, they are increasingly becoming obsolete due to inefficiencies, susceptibility to damage, and difficulty in data retrieval.</w:t>
       </w:r>
     </w:p>
     <w:p>
@@ -9557,7 +9607,14 @@
                 <w:color w:val="auto"/>
                 <w:sz w:val="19"/>
               </w:rPr>
-              <w:t>CEO &amp; Founder</w:t>
+              <w:t>DIRECTOR</w:t>
+            </w:r>
+            <w:r>
+              <w:rPr>
+                <w:color w:val="auto"/>
+                <w:sz w:val="19"/>
+              </w:rPr>
+              <w:t xml:space="preserve"> &amp; Founder</w:t>
             </w:r>
           </w:p>
         </w:tc>
@@ -14455,7 +14512,14 @@
         <w:rPr>
           <w:color w:val="auto"/>
         </w:rPr>
-        <w:t xml:space="preserve">. A clear routing structure was established with dedicated routes for authentication ( </w:t>
+        <w:t xml:space="preserve">. A clear routing structure was established with dedicated routes for authentication </w:t>
+      </w:r>
+      <w:proofErr w:type="gramStart"/>
+      <w:r>
+        <w:rPr>
+          <w:color w:val="auto"/>
+        </w:rPr>
+        <w:t xml:space="preserve">( </w:t>
       </w:r>
       <w:r>
         <w:rPr>
@@ -14463,7 +14527,110 @@
           <w:color w:val="auto"/>
           <w:sz w:val="22"/>
         </w:rPr>
-        <w:t xml:space="preserve">POST /api/login </w:t>
+        <w:t>POST</w:t>
+      </w:r>
+      <w:proofErr w:type="gramEnd"/>
+      <w:r>
+        <w:rPr>
+          <w:rFonts w:ascii="Courier New" w:eastAsia="Courier New" w:hAnsi="Courier New" w:cs="Courier New"/>
+          <w:color w:val="auto"/>
+          <w:sz w:val="22"/>
+        </w:rPr>
+        <w:t xml:space="preserve"> /api/</w:t>
+      </w:r>
+      <w:proofErr w:type="gramStart"/>
+      <w:r>
+        <w:rPr>
+          <w:rFonts w:ascii="Courier New" w:eastAsia="Courier New" w:hAnsi="Courier New" w:cs="Courier New"/>
+          <w:color w:val="auto"/>
+          <w:sz w:val="22"/>
+        </w:rPr>
+        <w:t xml:space="preserve">login </w:t>
+      </w:r>
+      <w:r>
+        <w:rPr>
+          <w:color w:val="auto"/>
+        </w:rPr>
+        <w:t>,</w:t>
+      </w:r>
+      <w:proofErr w:type="gramEnd"/>
+      <w:r>
+        <w:rPr>
+          <w:color w:val="auto"/>
+        </w:rPr>
+        <w:t xml:space="preserve"> </w:t>
+      </w:r>
+      <w:r>
+        <w:rPr>
+          <w:rFonts w:ascii="Courier New" w:eastAsia="Courier New" w:hAnsi="Courier New" w:cs="Courier New"/>
+          <w:color w:val="auto"/>
+          <w:sz w:val="22"/>
+        </w:rPr>
+        <w:t>POST /api/</w:t>
+      </w:r>
+      <w:proofErr w:type="gramStart"/>
+      <w:r>
+        <w:rPr>
+          <w:rFonts w:ascii="Courier New" w:eastAsia="Courier New" w:hAnsi="Courier New" w:cs="Courier New"/>
+          <w:color w:val="auto"/>
+          <w:sz w:val="22"/>
+        </w:rPr>
+        <w:t xml:space="preserve">signup </w:t>
+      </w:r>
+      <w:r>
+        <w:rPr>
+          <w:color w:val="auto"/>
+        </w:rPr>
+        <w:t>)</w:t>
+      </w:r>
+      <w:proofErr w:type="gramEnd"/>
+      <w:r>
+        <w:rPr>
+          <w:color w:val="auto"/>
+        </w:rPr>
+        <w:t xml:space="preserve">, student operations </w:t>
+      </w:r>
+      <w:proofErr w:type="gramStart"/>
+      <w:r>
+        <w:rPr>
+          <w:color w:val="auto"/>
+        </w:rPr>
+        <w:t xml:space="preserve">( </w:t>
+      </w:r>
+      <w:r>
+        <w:rPr>
+          <w:rFonts w:ascii="Courier New" w:eastAsia="Courier New" w:hAnsi="Courier New" w:cs="Courier New"/>
+          <w:color w:val="auto"/>
+          <w:sz w:val="22"/>
+        </w:rPr>
+        <w:t>GET</w:t>
+      </w:r>
+      <w:proofErr w:type="gramEnd"/>
+      <w:r>
+        <w:rPr>
+          <w:rFonts w:ascii="Courier New" w:eastAsia="Courier New" w:hAnsi="Courier New" w:cs="Courier New"/>
+          <w:color w:val="auto"/>
+          <w:sz w:val="22"/>
+        </w:rPr>
+        <w:t xml:space="preserve"> /api/students</w:t>
+      </w:r>
+      <w:proofErr w:type="gramStart"/>
+      <w:r>
+        <w:rPr>
+          <w:rFonts w:ascii="Courier New" w:eastAsia="Courier New" w:hAnsi="Courier New" w:cs="Courier New"/>
+          <w:color w:val="auto"/>
+          <w:sz w:val="22"/>
+        </w:rPr>
+        <w:t>/:email</w:t>
+      </w:r>
+      <w:proofErr w:type="gramEnd"/>
+      <w:r>
+        <w:rPr>
+          <w:rFonts w:ascii="Courier New" w:eastAsia="Courier New" w:hAnsi="Courier New" w:cs="Courier New"/>
+          <w:color w:val="auto"/>
+          <w:sz w:val="22"/>
+        </w:rPr>
+        <w:t xml:space="preserve"> </w:t>
       </w:r>
       <w:r>
         <w:rPr>
@@ -14477,27 +14644,36 @@
           <w:color w:val="auto"/>
           <w:sz w:val="22"/>
         </w:rPr>
-        <w:t xml:space="preserve">POST /api/signup </w:t>
-      </w:r>
-      <w:r>
-        <w:rPr>
-          <w:color w:val="auto"/>
-        </w:rPr>
-        <w:t xml:space="preserve">), student operations ( </w:t>
-      </w:r>
+        <w:t>/student/</w:t>
+      </w:r>
+      <w:proofErr w:type="gramStart"/>
       <w:r>
         <w:rPr>
           <w:rFonts w:ascii="Courier New" w:eastAsia="Courier New" w:hAnsi="Courier New" w:cs="Courier New"/>
           <w:color w:val="auto"/>
           <w:sz w:val="22"/>
         </w:rPr>
-        <w:t xml:space="preserve">GET /api/students/:email </w:t>
-      </w:r>
-      <w:r>
-        <w:rPr>
-          <w:color w:val="auto"/>
-        </w:rPr>
-        <w:t xml:space="preserve">, </w:t>
+        <w:t xml:space="preserve">grades </w:t>
+      </w:r>
+      <w:r>
+        <w:rPr>
+          <w:color w:val="auto"/>
+        </w:rPr>
+        <w:t>)</w:t>
+      </w:r>
+      <w:proofErr w:type="gramEnd"/>
+      <w:r>
+        <w:rPr>
+          <w:color w:val="auto"/>
+        </w:rPr>
+        <w:t xml:space="preserve">, and teacher operations </w:t>
+      </w:r>
+      <w:proofErr w:type="gramStart"/>
+      <w:r>
+        <w:rPr>
+          <w:color w:val="auto"/>
+        </w:rPr>
+        <w:t xml:space="preserve">( </w:t>
       </w:r>
       <w:r>
         <w:rPr>
@@ -14505,41 +14681,68 @@
           <w:color w:val="auto"/>
           <w:sz w:val="22"/>
         </w:rPr>
-        <w:t xml:space="preserve">/student/grades </w:t>
-      </w:r>
-      <w:r>
-        <w:rPr>
-          <w:color w:val="auto"/>
-        </w:rPr>
-        <w:t xml:space="preserve">), and teacher operations ( </w:t>
-      </w:r>
+        <w:t>PUT</w:t>
+      </w:r>
+      <w:proofErr w:type="gramEnd"/>
       <w:r>
         <w:rPr>
           <w:rFonts w:ascii="Courier New" w:eastAsia="Courier New" w:hAnsi="Courier New" w:cs="Courier New"/>
           <w:color w:val="auto"/>
           <w:sz w:val="22"/>
         </w:rPr>
-        <w:t xml:space="preserve">PUT /api/students/:id </w:t>
-      </w:r>
-      <w:r>
-        <w:rPr>
-          <w:color w:val="auto"/>
-        </w:rPr>
-        <w:t xml:space="preserve">, </w:t>
-      </w:r>
+        <w:t xml:space="preserve"> /api/students/:</w:t>
+      </w:r>
+      <w:proofErr w:type="gramStart"/>
       <w:r>
         <w:rPr>
           <w:rFonts w:ascii="Courier New" w:eastAsia="Courier New" w:hAnsi="Courier New" w:cs="Courier New"/>
           <w:color w:val="auto"/>
           <w:sz w:val="22"/>
         </w:rPr>
-        <w:t xml:space="preserve">/teacher/grades/edit </w:t>
-      </w:r>
-      <w:r>
-        <w:rPr>
-          <w:color w:val="auto"/>
-        </w:rPr>
-        <w:t>).</w:t>
+        <w:t xml:space="preserve">id </w:t>
+      </w:r>
+      <w:r>
+        <w:rPr>
+          <w:color w:val="auto"/>
+        </w:rPr>
+        <w:t>,</w:t>
+      </w:r>
+      <w:proofErr w:type="gramEnd"/>
+      <w:r>
+        <w:rPr>
+          <w:color w:val="auto"/>
+        </w:rPr>
+        <w:t xml:space="preserve"> </w:t>
+      </w:r>
+      <w:r>
+        <w:rPr>
+          <w:rFonts w:ascii="Courier New" w:eastAsia="Courier New" w:hAnsi="Courier New" w:cs="Courier New"/>
+          <w:color w:val="auto"/>
+          <w:sz w:val="22"/>
+        </w:rPr>
+        <w:t>/teacher/grades/</w:t>
+      </w:r>
+      <w:proofErr w:type="gramStart"/>
+      <w:r>
+        <w:rPr>
+          <w:rFonts w:ascii="Courier New" w:eastAsia="Courier New" w:hAnsi="Courier New" w:cs="Courier New"/>
+          <w:color w:val="auto"/>
+          <w:sz w:val="22"/>
+        </w:rPr>
+        <w:t xml:space="preserve">edit </w:t>
+      </w:r>
+      <w:r>
+        <w:rPr>
+          <w:color w:val="auto"/>
+        </w:rPr>
+        <w:t>)</w:t>
+      </w:r>
+      <w:proofErr w:type="gramEnd"/>
+      <w:r>
+        <w:rPr>
+          <w:color w:val="auto"/>
+        </w:rPr>
+        <w:t>.</w:t>
       </w:r>
     </w:p>
     <w:p>
@@ -16458,7 +16661,7 @@
           <w:sz w:val="20"/>
         </w:rPr>
         <w:drawing>
-          <wp:inline distT="0" distB="0" distL="0" distR="0" wp14:anchorId="5425376E" wp14:editId="73DD5E0C">
+          <wp:inline distT="0" distB="0" distL="0" distR="0" wp14:anchorId="5425376E" wp14:editId="7052CF8F">
             <wp:extent cx="5163670" cy="2864744"/>
             <wp:effectExtent l="0" t="0" r="0" b="0"/>
             <wp:docPr id="1456340086" name="Picture 47"/>

</xml_diff>